<commit_message>
feat(clara): Tabela 1 citada depois do F; Primeiro parágrafo com recuo de 1,25 cm no modelo do Word
Co-Authored-By: Claude Opus 5.5 <noreply@anthropic.com>
</commit_message>
<xml_diff>
--- a/inst/app/templates/custom-reference.docx
+++ b/inst/app/templates/custom-reference.docx
@@ -880,6 +880,10 @@
     <w:name w:val="First Paragraph"/>
     <w:basedOn w:val="Normal"/>
     <w:next w:val="Corpodetexto"/>
+    <w:pPr>
+      <w:spacing w:before="120"/>
+      <w:ind w:firstLine="709"/>
+    </w:pPr>
   </w:style>
   <w:style w:type="paragraph" w:customStyle="1" w:styleId="Compact">
     <w:name w:val="Compact"/>

</xml_diff>